<commit_message>
Cập nhật phần mềm
Cập nhật phần mềm theo chính sách mới của E08, tính tỷ lệ % của BCH
</commit_message>
<xml_diff>
--- a/HuongDan.docx
+++ b/HuongDan.docx
@@ -1,6 +1,6 @@
 
 <file path=word/document.xml><?xml version="1.0" encoding="utf-8"?>
-<w:document xmlns:wpc="http://schemas.microsoft.com/office/word/2010/wordprocessingCanvas" xmlns:cx="http://schemas.microsoft.com/office/drawing/2014/chartex" xmlns:cx1="http://schemas.microsoft.com/office/drawing/2015/9/8/chartex" xmlns:cx2="http://schemas.microsoft.com/office/drawing/2015/10/21/chartex" xmlns:cx3="http://schemas.microsoft.com/office/drawing/2016/5/9/chartex" xmlns:cx4="http://schemas.microsoft.com/office/drawing/2016/5/10/chartex" xmlns:cx5="http://schemas.microsoft.com/office/drawing/2016/5/11/chartex" xmlns:cx6="http://schemas.microsoft.com/office/drawing/2016/5/12/chartex" xmlns:cx7="http://schemas.microsoft.com/office/drawing/2016/5/13/chartex" xmlns:cx8="http://schemas.microsoft.com/office/drawing/2016/5/14/chartex" xmlns:mc="http://schemas.openxmlformats.org/markup-compatibility/2006" xmlns:aink="http://schemas.microsoft.com/office/drawing/2016/ink" xmlns:am3d="http://schemas.microsoft.com/office/drawing/2017/model3d" xmlns:o="urn:schemas-microsoft-com:office:office" xmlns:oel="http://schemas.microsoft.com/office/2019/extlst" xmlns:r="http://schemas.openxmlformats.org/officeDocument/2006/relationships" xmlns:m="http://schemas.openxmlformats.org/officeDocument/2006/math" xmlns:v="urn:schemas-microsoft-com:vml" xmlns:wp14="http://schemas.microsoft.com/office/word/2010/wordprocessingDrawing" xmlns:wp="http://schemas.openxmlformats.org/drawingml/2006/wordprocessingDrawing" xmlns:w10="urn:schemas-microsoft-com:office:word" xmlns:w="http://schemas.openxmlformats.org/wordprocessingml/2006/main" xmlns:w14="http://schemas.microsoft.com/office/word/2010/wordml" xmlns:w15="http://schemas.microsoft.com/office/word/2012/wordml" xmlns:w16cex="http://schemas.microsoft.com/office/word/2018/wordml/cex" xmlns:w16cid="http://schemas.microsoft.com/office/word/2016/wordml/cid" xmlns:w16="http://schemas.microsoft.com/office/word/2018/wordml" xmlns:w16du="http://schemas.microsoft.com/office/word/2023/wordml/word16du" xmlns:w16sdtdh="http://schemas.microsoft.com/office/word/2020/wordml/sdtdatahash" xmlns:w16sdtfl="http://schemas.microsoft.com/office/word/2024/wordml/sdtformatlock" xmlns:w16se="http://schemas.microsoft.com/office/word/2015/wordml/symex" xmlns:wpg="http://schemas.microsoft.com/office/word/2010/wordprocessingGroup" xmlns:wpi="http://schemas.microsoft.com/office/word/2010/wordprocessingInk" xmlns:wne="http://schemas.microsoft.com/office/word/2006/wordml" xmlns:wps="http://schemas.microsoft.com/office/word/2010/wordprocessingShape" mc:Ignorable="w14 w15 w16se w16cid w16 w16cex w16sdtdh w16sdtfl w16du wp14">
+<w:document xmlns:wpc="http://schemas.microsoft.com/office/word/2010/wordprocessingCanvas" xmlns:cx="http://schemas.microsoft.com/office/drawing/2014/chartex" xmlns:cx1="http://schemas.microsoft.com/office/drawing/2015/9/8/chartex" xmlns:cx2="http://schemas.microsoft.com/office/drawing/2015/10/21/chartex" xmlns:cx3="http://schemas.microsoft.com/office/drawing/2016/5/9/chartex" xmlns:cx4="http://schemas.microsoft.com/office/drawing/2016/5/10/chartex" xmlns:cx5="http://schemas.microsoft.com/office/drawing/2016/5/11/chartex" xmlns:cx6="http://schemas.microsoft.com/office/drawing/2016/5/12/chartex" xmlns:cx7="http://schemas.microsoft.com/office/drawing/2016/5/13/chartex" xmlns:cx8="http://schemas.microsoft.com/office/drawing/2016/5/14/chartex" xmlns:mc="http://schemas.openxmlformats.org/markup-compatibility/2006" xmlns:aink="http://schemas.microsoft.com/office/drawing/2016/ink" xmlns:am3d="http://schemas.microsoft.com/office/drawing/2017/model3d" xmlns:o="urn:schemas-microsoft-com:office:office" xmlns:oel="http://schemas.microsoft.com/office/2019/extlst" xmlns:r="http://schemas.openxmlformats.org/officeDocument/2006/relationships" xmlns:m="http://schemas.openxmlformats.org/officeDocument/2006/math" xmlns:v="urn:schemas-microsoft-com:vml" xmlns:wp14="http://schemas.microsoft.com/office/word/2010/wordprocessingDrawing" xmlns:wp="http://schemas.openxmlformats.org/drawingml/2006/wordprocessingDrawing" xmlns:w10="urn:schemas-microsoft-com:office:word" xmlns:w="http://schemas.openxmlformats.org/wordprocessingml/2006/main" xmlns:w14="http://schemas.microsoft.com/office/word/2010/wordml" xmlns:w15="http://schemas.microsoft.com/office/word/2012/wordml" xmlns:w16cei="http://schemas.microsoft.com/office/word/2026/wordml/cei" xmlns:w16cex="http://schemas.microsoft.com/office/word/2018/wordml/cex" xmlns:w16cid="http://schemas.microsoft.com/office/word/2016/wordml/cid" xmlns:w16="http://schemas.microsoft.com/office/word/2018/wordml" xmlns:w16du="http://schemas.microsoft.com/office/word/2023/wordml/word16du" xmlns:w16sdtdh="http://schemas.microsoft.com/office/word/2020/wordml/sdtdatahash" xmlns:w16sdtfl="http://schemas.microsoft.com/office/word/2024/wordml/sdtformatlock" xmlns:w16se="http://schemas.microsoft.com/office/word/2015/wordml/symex" xmlns:wpg="http://schemas.microsoft.com/office/word/2010/wordprocessingGroup" xmlns:wpi="http://schemas.microsoft.com/office/word/2010/wordprocessingInk" xmlns:wne="http://schemas.microsoft.com/office/word/2006/wordml" xmlns:wps="http://schemas.microsoft.com/office/word/2010/wordprocessingShape" mc:Ignorable="w14 w15 w16se w16cid w16 w16cex w16sdtdh w16sdtfl w16du wp14">
   <w:body>
     <w:p>
       <w:pPr>
@@ -146,7 +146,7 @@
     <w:sdt>
       <w:sdtPr>
         <w:rPr>
-          <w:rFonts w:eastAsiaTheme="minorHAnsi" w:cstheme="minorBidi"/>
+          <w:rFonts w:ascii="Times New Roman" w:eastAsiaTheme="minorHAnsi" w:hAnsi="Times New Roman" w:cstheme="minorBidi"/>
           <w:color w:val="auto"/>
           <w:kern w:val="2"/>
           <w:sz w:val="28"/>
@@ -161,7 +161,6 @@
       </w:sdtPr>
       <w:sdtEndPr>
         <w:rPr>
-          <w:rFonts w:ascii="Times New Roman" w:hAnsi="Times New Roman"/>
           <w:b/>
           <w:bCs/>
           <w:noProof/>
@@ -5902,7 +5901,19 @@
         <w:rPr>
           <w:lang w:val="pt-BR"/>
         </w:rPr>
-        <w:t xml:space="preserve">mã nguồn đóng, </w:t>
+        <w:t xml:space="preserve">mã nguồn </w:t>
+      </w:r>
+      <w:r>
+        <w:rPr>
+          <w:lang w:val="pt-BR"/>
+        </w:rPr>
+        <w:t>mở</w:t>
+      </w:r>
+      <w:r>
+        <w:rPr>
+          <w:lang w:val="pt-BR"/>
+        </w:rPr>
+        <w:t xml:space="preserve">, </w:t>
       </w:r>
       <w:r>
         <w:rPr>
@@ -10200,6 +10211,9 @@
         <w:spacing w:after="0"/>
       </w:pPr>
       <w:r>
+        <w:rPr>
+          <w:noProof/>
+        </w:rPr>
         <w:drawing>
           <wp:inline distT="0" distB="0" distL="0" distR="0" wp14:anchorId="2CA270E7" wp14:editId="6ED215EC">
             <wp:extent cx="5059680" cy="4696085"/>
@@ -11512,6 +11526,9 @@
         <w:ind w:hanging="1276"/>
       </w:pPr>
       <w:r>
+        <w:rPr>
+          <w:noProof/>
+        </w:rPr>
         <w:drawing>
           <wp:inline distT="0" distB="0" distL="0" distR="0" wp14:anchorId="47F13294" wp14:editId="4CFA4D4F">
             <wp:extent cx="6739368" cy="3533335"/>
@@ -12089,25 +12106,7 @@
           <w:iCs/>
           <w:color w:val="auto"/>
         </w:rPr>
-        <w:t xml:space="preserve">Chỉnh sửa thông tin, cập nhật phân </w:t>
-      </w:r>
-      <w:proofErr w:type="gramStart"/>
-      <w:r>
-        <w:rPr>
-          <w:i/>
-          <w:iCs/>
-          <w:color w:val="auto"/>
-        </w:rPr>
-        <w:t>loại  -</w:t>
-      </w:r>
-      <w:proofErr w:type="gramEnd"/>
-      <w:r>
-        <w:rPr>
-          <w:i/>
-          <w:iCs/>
-          <w:color w:val="auto"/>
-        </w:rPr>
-        <w:t xml:space="preserve"> Đúp chuột vào Dòng thông tin (Tên của CBCS trong cột Họ và tên trên trang Thống kê) Form điều chỉnh sẽ hiện ra để điều chỉnh thông tin thi đua cũng như cập nhật kế quả khen thưởng trong năm.</w:t>
+        <w:t>Chỉnh sửa thông tin, cập nhật phân loại  - Đúp chuột vào Dòng thông tin (Tên của CBCS trong cột Họ và tên trên trang Thống kê) Form điều chỉnh sẽ hiện ra để điều chỉnh thông tin thi đua cũng như cập nhật kế quả khen thưởng trong năm.</w:t>
       </w:r>
     </w:p>
     <w:p>
@@ -12627,6 +12626,9 @@
         <w:jc w:val="center"/>
       </w:pPr>
       <w:r>
+        <w:rPr>
+          <w:noProof/>
+        </w:rPr>
         <w:drawing>
           <wp:inline distT="0" distB="0" distL="0" distR="0" wp14:anchorId="2075A926" wp14:editId="316E437A">
             <wp:extent cx="6859905" cy="3613749"/>
@@ -13920,7 +13922,7 @@
 </file>
 
 <file path=word/endnotes.xml><?xml version="1.0" encoding="utf-8"?>
-<w:endnotes xmlns:wpc="http://schemas.microsoft.com/office/word/2010/wordprocessingCanvas" xmlns:cx="http://schemas.microsoft.com/office/drawing/2014/chartex" xmlns:cx1="http://schemas.microsoft.com/office/drawing/2015/9/8/chartex" xmlns:cx2="http://schemas.microsoft.com/office/drawing/2015/10/21/chartex" xmlns:cx3="http://schemas.microsoft.com/office/drawing/2016/5/9/chartex" xmlns:cx4="http://schemas.microsoft.com/office/drawing/2016/5/10/chartex" xmlns:cx5="http://schemas.microsoft.com/office/drawing/2016/5/11/chartex" xmlns:cx6="http://schemas.microsoft.com/office/drawing/2016/5/12/chartex" xmlns:cx7="http://schemas.microsoft.com/office/drawing/2016/5/13/chartex" xmlns:cx8="http://schemas.microsoft.com/office/drawing/2016/5/14/chartex" xmlns:mc="http://schemas.openxmlformats.org/markup-compatibility/2006" xmlns:aink="http://schemas.microsoft.com/office/drawing/2016/ink" xmlns:am3d="http://schemas.microsoft.com/office/drawing/2017/model3d" xmlns:o="urn:schemas-microsoft-com:office:office" xmlns:oel="http://schemas.microsoft.com/office/2019/extlst" xmlns:r="http://schemas.openxmlformats.org/officeDocument/2006/relationships" xmlns:m="http://schemas.openxmlformats.org/officeDocument/2006/math" xmlns:v="urn:schemas-microsoft-com:vml" xmlns:wp14="http://schemas.microsoft.com/office/word/2010/wordprocessingDrawing" xmlns:wp="http://schemas.openxmlformats.org/drawingml/2006/wordprocessingDrawing" xmlns:w10="urn:schemas-microsoft-com:office:word" xmlns:w="http://schemas.openxmlformats.org/wordprocessingml/2006/main" xmlns:w14="http://schemas.microsoft.com/office/word/2010/wordml" xmlns:w15="http://schemas.microsoft.com/office/word/2012/wordml" xmlns:w16cex="http://schemas.microsoft.com/office/word/2018/wordml/cex" xmlns:w16cid="http://schemas.microsoft.com/office/word/2016/wordml/cid" xmlns:w16="http://schemas.microsoft.com/office/word/2018/wordml" xmlns:w16du="http://schemas.microsoft.com/office/word/2023/wordml/word16du" xmlns:w16sdtdh="http://schemas.microsoft.com/office/word/2020/wordml/sdtdatahash" xmlns:w16sdtfl="http://schemas.microsoft.com/office/word/2024/wordml/sdtformatlock" xmlns:w16se="http://schemas.microsoft.com/office/word/2015/wordml/symex" xmlns:wpg="http://schemas.microsoft.com/office/word/2010/wordprocessingGroup" xmlns:wpi="http://schemas.microsoft.com/office/word/2010/wordprocessingInk" xmlns:wne="http://schemas.microsoft.com/office/word/2006/wordml" xmlns:wps="http://schemas.microsoft.com/office/word/2010/wordprocessingShape" mc:Ignorable="w14 w15 w16se w16cid w16 w16cex w16sdtdh w16sdtfl w16du wp14">
+<w:endnotes xmlns:wpc="http://schemas.microsoft.com/office/word/2010/wordprocessingCanvas" xmlns:cx="http://schemas.microsoft.com/office/drawing/2014/chartex" xmlns:cx1="http://schemas.microsoft.com/office/drawing/2015/9/8/chartex" xmlns:cx2="http://schemas.microsoft.com/office/drawing/2015/10/21/chartex" xmlns:cx3="http://schemas.microsoft.com/office/drawing/2016/5/9/chartex" xmlns:cx4="http://schemas.microsoft.com/office/drawing/2016/5/10/chartex" xmlns:cx5="http://schemas.microsoft.com/office/drawing/2016/5/11/chartex" xmlns:cx6="http://schemas.microsoft.com/office/drawing/2016/5/12/chartex" xmlns:cx7="http://schemas.microsoft.com/office/drawing/2016/5/13/chartex" xmlns:cx8="http://schemas.microsoft.com/office/drawing/2016/5/14/chartex" xmlns:mc="http://schemas.openxmlformats.org/markup-compatibility/2006" xmlns:aink="http://schemas.microsoft.com/office/drawing/2016/ink" xmlns:am3d="http://schemas.microsoft.com/office/drawing/2017/model3d" xmlns:o="urn:schemas-microsoft-com:office:office" xmlns:oel="http://schemas.microsoft.com/office/2019/extlst" xmlns:r="http://schemas.openxmlformats.org/officeDocument/2006/relationships" xmlns:m="http://schemas.openxmlformats.org/officeDocument/2006/math" xmlns:v="urn:schemas-microsoft-com:vml" xmlns:wp14="http://schemas.microsoft.com/office/word/2010/wordprocessingDrawing" xmlns:wp="http://schemas.openxmlformats.org/drawingml/2006/wordprocessingDrawing" xmlns:w10="urn:schemas-microsoft-com:office:word" xmlns:w="http://schemas.openxmlformats.org/wordprocessingml/2006/main" xmlns:w14="http://schemas.microsoft.com/office/word/2010/wordml" xmlns:w15="http://schemas.microsoft.com/office/word/2012/wordml" xmlns:w16cei="http://schemas.microsoft.com/office/word/2026/wordml/cei" xmlns:w16cex="http://schemas.microsoft.com/office/word/2018/wordml/cex" xmlns:w16cid="http://schemas.microsoft.com/office/word/2016/wordml/cid" xmlns:w16="http://schemas.microsoft.com/office/word/2018/wordml" xmlns:w16du="http://schemas.microsoft.com/office/word/2023/wordml/word16du" xmlns:w16sdtdh="http://schemas.microsoft.com/office/word/2020/wordml/sdtdatahash" xmlns:w16sdtfl="http://schemas.microsoft.com/office/word/2024/wordml/sdtformatlock" xmlns:w16se="http://schemas.microsoft.com/office/word/2015/wordml/symex" xmlns:wpg="http://schemas.microsoft.com/office/word/2010/wordprocessingGroup" xmlns:wpi="http://schemas.microsoft.com/office/word/2010/wordprocessingInk" xmlns:wne="http://schemas.microsoft.com/office/word/2006/wordml" xmlns:wps="http://schemas.microsoft.com/office/word/2010/wordprocessingShape" mc:Ignorable="w14 w15 w16se w16cid w16 w16cex w16sdtdh w16sdtfl w16du wp14">
   <w:endnote w:type="separator" w:id="-1">
     <w:p>
       <w:pPr>
@@ -13945,7 +13947,7 @@
 </file>
 
 <file path=word/footnotes.xml><?xml version="1.0" encoding="utf-8"?>
-<w:footnotes xmlns:wpc="http://schemas.microsoft.com/office/word/2010/wordprocessingCanvas" xmlns:cx="http://schemas.microsoft.com/office/drawing/2014/chartex" xmlns:cx1="http://schemas.microsoft.com/office/drawing/2015/9/8/chartex" xmlns:cx2="http://schemas.microsoft.com/office/drawing/2015/10/21/chartex" xmlns:cx3="http://schemas.microsoft.com/office/drawing/2016/5/9/chartex" xmlns:cx4="http://schemas.microsoft.com/office/drawing/2016/5/10/chartex" xmlns:cx5="http://schemas.microsoft.com/office/drawing/2016/5/11/chartex" xmlns:cx6="http://schemas.microsoft.com/office/drawing/2016/5/12/chartex" xmlns:cx7="http://schemas.microsoft.com/office/drawing/2016/5/13/chartex" xmlns:cx8="http://schemas.microsoft.com/office/drawing/2016/5/14/chartex" xmlns:mc="http://schemas.openxmlformats.org/markup-compatibility/2006" xmlns:aink="http://schemas.microsoft.com/office/drawing/2016/ink" xmlns:am3d="http://schemas.microsoft.com/office/drawing/2017/model3d" xmlns:o="urn:schemas-microsoft-com:office:office" xmlns:oel="http://schemas.microsoft.com/office/2019/extlst" xmlns:r="http://schemas.openxmlformats.org/officeDocument/2006/relationships" xmlns:m="http://schemas.openxmlformats.org/officeDocument/2006/math" xmlns:v="urn:schemas-microsoft-com:vml" xmlns:wp14="http://schemas.microsoft.com/office/word/2010/wordprocessingDrawing" xmlns:wp="http://schemas.openxmlformats.org/drawingml/2006/wordprocessingDrawing" xmlns:w10="urn:schemas-microsoft-com:office:word" xmlns:w="http://schemas.openxmlformats.org/wordprocessingml/2006/main" xmlns:w14="http://schemas.microsoft.com/office/word/2010/wordml" xmlns:w15="http://schemas.microsoft.com/office/word/2012/wordml" xmlns:w16cex="http://schemas.microsoft.com/office/word/2018/wordml/cex" xmlns:w16cid="http://schemas.microsoft.com/office/word/2016/wordml/cid" xmlns:w16="http://schemas.microsoft.com/office/word/2018/wordml" xmlns:w16du="http://schemas.microsoft.com/office/word/2023/wordml/word16du" xmlns:w16sdtdh="http://schemas.microsoft.com/office/word/2020/wordml/sdtdatahash" xmlns:w16sdtfl="http://schemas.microsoft.com/office/word/2024/wordml/sdtformatlock" xmlns:w16se="http://schemas.microsoft.com/office/word/2015/wordml/symex" xmlns:wpg="http://schemas.microsoft.com/office/word/2010/wordprocessingGroup" xmlns:wpi="http://schemas.microsoft.com/office/word/2010/wordprocessingInk" xmlns:wne="http://schemas.microsoft.com/office/word/2006/wordml" xmlns:wps="http://schemas.microsoft.com/office/word/2010/wordprocessingShape" mc:Ignorable="w14 w15 w16se w16cid w16 w16cex w16sdtdh w16sdtfl w16du wp14">
+<w:footnotes xmlns:wpc="http://schemas.microsoft.com/office/word/2010/wordprocessingCanvas" xmlns:cx="http://schemas.microsoft.com/office/drawing/2014/chartex" xmlns:cx1="http://schemas.microsoft.com/office/drawing/2015/9/8/chartex" xmlns:cx2="http://schemas.microsoft.com/office/drawing/2015/10/21/chartex" xmlns:cx3="http://schemas.microsoft.com/office/drawing/2016/5/9/chartex" xmlns:cx4="http://schemas.microsoft.com/office/drawing/2016/5/10/chartex" xmlns:cx5="http://schemas.microsoft.com/office/drawing/2016/5/11/chartex" xmlns:cx6="http://schemas.microsoft.com/office/drawing/2016/5/12/chartex" xmlns:cx7="http://schemas.microsoft.com/office/drawing/2016/5/13/chartex" xmlns:cx8="http://schemas.microsoft.com/office/drawing/2016/5/14/chartex" xmlns:mc="http://schemas.openxmlformats.org/markup-compatibility/2006" xmlns:aink="http://schemas.microsoft.com/office/drawing/2016/ink" xmlns:am3d="http://schemas.microsoft.com/office/drawing/2017/model3d" xmlns:o="urn:schemas-microsoft-com:office:office" xmlns:oel="http://schemas.microsoft.com/office/2019/extlst" xmlns:r="http://schemas.openxmlformats.org/officeDocument/2006/relationships" xmlns:m="http://schemas.openxmlformats.org/officeDocument/2006/math" xmlns:v="urn:schemas-microsoft-com:vml" xmlns:wp14="http://schemas.microsoft.com/office/word/2010/wordprocessingDrawing" xmlns:wp="http://schemas.openxmlformats.org/drawingml/2006/wordprocessingDrawing" xmlns:w10="urn:schemas-microsoft-com:office:word" xmlns:w="http://schemas.openxmlformats.org/wordprocessingml/2006/main" xmlns:w14="http://schemas.microsoft.com/office/word/2010/wordml" xmlns:w15="http://schemas.microsoft.com/office/word/2012/wordml" xmlns:w16cei="http://schemas.microsoft.com/office/word/2026/wordml/cei" xmlns:w16cex="http://schemas.microsoft.com/office/word/2018/wordml/cex" xmlns:w16cid="http://schemas.microsoft.com/office/word/2016/wordml/cid" xmlns:w16="http://schemas.microsoft.com/office/word/2018/wordml" xmlns:w16du="http://schemas.microsoft.com/office/word/2023/wordml/word16du" xmlns:w16sdtdh="http://schemas.microsoft.com/office/word/2020/wordml/sdtdatahash" xmlns:w16sdtfl="http://schemas.microsoft.com/office/word/2024/wordml/sdtformatlock" xmlns:w16se="http://schemas.microsoft.com/office/word/2015/wordml/symex" xmlns:wpg="http://schemas.microsoft.com/office/word/2010/wordprocessingGroup" xmlns:wpi="http://schemas.microsoft.com/office/word/2010/wordprocessingInk" xmlns:wne="http://schemas.microsoft.com/office/word/2006/wordml" xmlns:wps="http://schemas.microsoft.com/office/word/2010/wordprocessingShape" mc:Ignorable="w14 w15 w16se w16cid w16 w16cex w16sdtdh w16sdtfl w16du wp14">
   <w:footnote w:type="separator" w:id="-1">
     <w:p>
       <w:pPr>
@@ -13970,7 +13972,7 @@
 </file>
 
 <file path=word/header1.xml><?xml version="1.0" encoding="utf-8"?>
-<w:hdr xmlns:wpc="http://schemas.microsoft.com/office/word/2010/wordprocessingCanvas" xmlns:cx="http://schemas.microsoft.com/office/drawing/2014/chartex" xmlns:cx1="http://schemas.microsoft.com/office/drawing/2015/9/8/chartex" xmlns:cx2="http://schemas.microsoft.com/office/drawing/2015/10/21/chartex" xmlns:cx3="http://schemas.microsoft.com/office/drawing/2016/5/9/chartex" xmlns:cx4="http://schemas.microsoft.com/office/drawing/2016/5/10/chartex" xmlns:cx5="http://schemas.microsoft.com/office/drawing/2016/5/11/chartex" xmlns:cx6="http://schemas.microsoft.com/office/drawing/2016/5/12/chartex" xmlns:cx7="http://schemas.microsoft.com/office/drawing/2016/5/13/chartex" xmlns:cx8="http://schemas.microsoft.com/office/drawing/2016/5/14/chartex" xmlns:mc="http://schemas.openxmlformats.org/markup-compatibility/2006" xmlns:aink="http://schemas.microsoft.com/office/drawing/2016/ink" xmlns:am3d="http://schemas.microsoft.com/office/drawing/2017/model3d" xmlns:o="urn:schemas-microsoft-com:office:office" xmlns:oel="http://schemas.microsoft.com/office/2019/extlst" xmlns:r="http://schemas.openxmlformats.org/officeDocument/2006/relationships" xmlns:m="http://schemas.openxmlformats.org/officeDocument/2006/math" xmlns:v="urn:schemas-microsoft-com:vml" xmlns:wp14="http://schemas.microsoft.com/office/word/2010/wordprocessingDrawing" xmlns:wp="http://schemas.openxmlformats.org/drawingml/2006/wordprocessingDrawing" xmlns:w10="urn:schemas-microsoft-com:office:word" xmlns:w="http://schemas.openxmlformats.org/wordprocessingml/2006/main" xmlns:w14="http://schemas.microsoft.com/office/word/2010/wordml" xmlns:w15="http://schemas.microsoft.com/office/word/2012/wordml" xmlns:w16cex="http://schemas.microsoft.com/office/word/2018/wordml/cex" xmlns:w16cid="http://schemas.microsoft.com/office/word/2016/wordml/cid" xmlns:w16="http://schemas.microsoft.com/office/word/2018/wordml" xmlns:w16du="http://schemas.microsoft.com/office/word/2023/wordml/word16du" xmlns:w16sdtdh="http://schemas.microsoft.com/office/word/2020/wordml/sdtdatahash" xmlns:w16sdtfl="http://schemas.microsoft.com/office/word/2024/wordml/sdtformatlock" xmlns:w16se="http://schemas.microsoft.com/office/word/2015/wordml/symex" xmlns:wpg="http://schemas.microsoft.com/office/word/2010/wordprocessingGroup" xmlns:wpi="http://schemas.microsoft.com/office/word/2010/wordprocessingInk" xmlns:wne="http://schemas.microsoft.com/office/word/2006/wordml" xmlns:wps="http://schemas.microsoft.com/office/word/2010/wordprocessingShape" mc:Ignorable="w14 w15 w16se w16cid w16 w16cex w16sdtdh w16sdtfl w16du wp14">
+<w:hdr xmlns:wpc="http://schemas.microsoft.com/office/word/2010/wordprocessingCanvas" xmlns:cx="http://schemas.microsoft.com/office/drawing/2014/chartex" xmlns:cx1="http://schemas.microsoft.com/office/drawing/2015/9/8/chartex" xmlns:cx2="http://schemas.microsoft.com/office/drawing/2015/10/21/chartex" xmlns:cx3="http://schemas.microsoft.com/office/drawing/2016/5/9/chartex" xmlns:cx4="http://schemas.microsoft.com/office/drawing/2016/5/10/chartex" xmlns:cx5="http://schemas.microsoft.com/office/drawing/2016/5/11/chartex" xmlns:cx6="http://schemas.microsoft.com/office/drawing/2016/5/12/chartex" xmlns:cx7="http://schemas.microsoft.com/office/drawing/2016/5/13/chartex" xmlns:cx8="http://schemas.microsoft.com/office/drawing/2016/5/14/chartex" xmlns:mc="http://schemas.openxmlformats.org/markup-compatibility/2006" xmlns:aink="http://schemas.microsoft.com/office/drawing/2016/ink" xmlns:am3d="http://schemas.microsoft.com/office/drawing/2017/model3d" xmlns:o="urn:schemas-microsoft-com:office:office" xmlns:oel="http://schemas.microsoft.com/office/2019/extlst" xmlns:r="http://schemas.openxmlformats.org/officeDocument/2006/relationships" xmlns:m="http://schemas.openxmlformats.org/officeDocument/2006/math" xmlns:v="urn:schemas-microsoft-com:vml" xmlns:wp14="http://schemas.microsoft.com/office/word/2010/wordprocessingDrawing" xmlns:wp="http://schemas.openxmlformats.org/drawingml/2006/wordprocessingDrawing" xmlns:w10="urn:schemas-microsoft-com:office:word" xmlns:w="http://schemas.openxmlformats.org/wordprocessingml/2006/main" xmlns:w14="http://schemas.microsoft.com/office/word/2010/wordml" xmlns:w15="http://schemas.microsoft.com/office/word/2012/wordml" xmlns:w16cei="http://schemas.microsoft.com/office/word/2026/wordml/cei" xmlns:w16cex="http://schemas.microsoft.com/office/word/2018/wordml/cex" xmlns:w16cid="http://schemas.microsoft.com/office/word/2016/wordml/cid" xmlns:w16="http://schemas.microsoft.com/office/word/2018/wordml" xmlns:w16du="http://schemas.microsoft.com/office/word/2023/wordml/word16du" xmlns:w16sdtdh="http://schemas.microsoft.com/office/word/2020/wordml/sdtdatahash" xmlns:w16sdtfl="http://schemas.microsoft.com/office/word/2024/wordml/sdtformatlock" xmlns:w16se="http://schemas.microsoft.com/office/word/2015/wordml/symex" xmlns:wpg="http://schemas.microsoft.com/office/word/2010/wordprocessingGroup" xmlns:wpi="http://schemas.microsoft.com/office/word/2010/wordprocessingInk" xmlns:wne="http://schemas.microsoft.com/office/word/2006/wordml" xmlns:wps="http://schemas.microsoft.com/office/word/2010/wordprocessingShape" mc:Ignorable="w14 w15 w16se w16cid w16 w16cex w16sdtdh w16sdtfl w16du wp14">
   <w:p>
     <w:pPr>
       <w:pStyle w:val="Header"/>
@@ -14020,7 +14022,7 @@
 </file>
 
 <file path=word/numbering.xml><?xml version="1.0" encoding="utf-8"?>
-<w:numbering xmlns:wpc="http://schemas.microsoft.com/office/word/2010/wordprocessingCanvas" xmlns:cx="http://schemas.microsoft.com/office/drawing/2014/chartex" xmlns:cx1="http://schemas.microsoft.com/office/drawing/2015/9/8/chartex" xmlns:cx2="http://schemas.microsoft.com/office/drawing/2015/10/21/chartex" xmlns:cx3="http://schemas.microsoft.com/office/drawing/2016/5/9/chartex" xmlns:cx4="http://schemas.microsoft.com/office/drawing/2016/5/10/chartex" xmlns:cx5="http://schemas.microsoft.com/office/drawing/2016/5/11/chartex" xmlns:cx6="http://schemas.microsoft.com/office/drawing/2016/5/12/chartex" xmlns:cx7="http://schemas.microsoft.com/office/drawing/2016/5/13/chartex" xmlns:cx8="http://schemas.microsoft.com/office/drawing/2016/5/14/chartex" xmlns:mc="http://schemas.openxmlformats.org/markup-compatibility/2006" xmlns:aink="http://schemas.microsoft.com/office/drawing/2016/ink" xmlns:am3d="http://schemas.microsoft.com/office/drawing/2017/model3d" xmlns:o="urn:schemas-microsoft-com:office:office" xmlns:oel="http://schemas.microsoft.com/office/2019/extlst" xmlns:r="http://schemas.openxmlformats.org/officeDocument/2006/relationships" xmlns:m="http://schemas.openxmlformats.org/officeDocument/2006/math" xmlns:v="urn:schemas-microsoft-com:vml" xmlns:wp14="http://schemas.microsoft.com/office/word/2010/wordprocessingDrawing" xmlns:wp="http://schemas.openxmlformats.org/drawingml/2006/wordprocessingDrawing" xmlns:w10="urn:schemas-microsoft-com:office:word" xmlns:w="http://schemas.openxmlformats.org/wordprocessingml/2006/main" xmlns:w14="http://schemas.microsoft.com/office/word/2010/wordml" xmlns:w15="http://schemas.microsoft.com/office/word/2012/wordml" xmlns:w16cex="http://schemas.microsoft.com/office/word/2018/wordml/cex" xmlns:w16cid="http://schemas.microsoft.com/office/word/2016/wordml/cid" xmlns:w16="http://schemas.microsoft.com/office/word/2018/wordml" xmlns:w16du="http://schemas.microsoft.com/office/word/2023/wordml/word16du" xmlns:w16sdtdh="http://schemas.microsoft.com/office/word/2020/wordml/sdtdatahash" xmlns:w16sdtfl="http://schemas.microsoft.com/office/word/2024/wordml/sdtformatlock" xmlns:w16se="http://schemas.microsoft.com/office/word/2015/wordml/symex" xmlns:wpg="http://schemas.microsoft.com/office/word/2010/wordprocessingGroup" xmlns:wpi="http://schemas.microsoft.com/office/word/2010/wordprocessingInk" xmlns:wne="http://schemas.microsoft.com/office/word/2006/wordml" xmlns:wps="http://schemas.microsoft.com/office/word/2010/wordprocessingShape" mc:Ignorable="w14 w15 w16se w16cid w16 w16cex w16sdtdh w16sdtfl w16du wp14">
+<w:numbering xmlns:wpc="http://schemas.microsoft.com/office/word/2010/wordprocessingCanvas" xmlns:cx="http://schemas.microsoft.com/office/drawing/2014/chartex" xmlns:cx1="http://schemas.microsoft.com/office/drawing/2015/9/8/chartex" xmlns:cx2="http://schemas.microsoft.com/office/drawing/2015/10/21/chartex" xmlns:cx3="http://schemas.microsoft.com/office/drawing/2016/5/9/chartex" xmlns:cx4="http://schemas.microsoft.com/office/drawing/2016/5/10/chartex" xmlns:cx5="http://schemas.microsoft.com/office/drawing/2016/5/11/chartex" xmlns:cx6="http://schemas.microsoft.com/office/drawing/2016/5/12/chartex" xmlns:cx7="http://schemas.microsoft.com/office/drawing/2016/5/13/chartex" xmlns:cx8="http://schemas.microsoft.com/office/drawing/2016/5/14/chartex" xmlns:mc="http://schemas.openxmlformats.org/markup-compatibility/2006" xmlns:aink="http://schemas.microsoft.com/office/drawing/2016/ink" xmlns:am3d="http://schemas.microsoft.com/office/drawing/2017/model3d" xmlns:o="urn:schemas-microsoft-com:office:office" xmlns:oel="http://schemas.microsoft.com/office/2019/extlst" xmlns:r="http://schemas.openxmlformats.org/officeDocument/2006/relationships" xmlns:m="http://schemas.openxmlformats.org/officeDocument/2006/math" xmlns:v="urn:schemas-microsoft-com:vml" xmlns:wp14="http://schemas.microsoft.com/office/word/2010/wordprocessingDrawing" xmlns:wp="http://schemas.openxmlformats.org/drawingml/2006/wordprocessingDrawing" xmlns:w10="urn:schemas-microsoft-com:office:word" xmlns:w="http://schemas.openxmlformats.org/wordprocessingml/2006/main" xmlns:w14="http://schemas.microsoft.com/office/word/2010/wordml" xmlns:w15="http://schemas.microsoft.com/office/word/2012/wordml" xmlns:w16cei="http://schemas.microsoft.com/office/word/2026/wordml/cei" xmlns:w16cex="http://schemas.microsoft.com/office/word/2018/wordml/cex" xmlns:w16cid="http://schemas.microsoft.com/office/word/2016/wordml/cid" xmlns:w16="http://schemas.microsoft.com/office/word/2018/wordml" xmlns:w16du="http://schemas.microsoft.com/office/word/2023/wordml/word16du" xmlns:w16sdtdh="http://schemas.microsoft.com/office/word/2020/wordml/sdtdatahash" xmlns:w16sdtfl="http://schemas.microsoft.com/office/word/2024/wordml/sdtformatlock" xmlns:w16se="http://schemas.microsoft.com/office/word/2015/wordml/symex" xmlns:wpg="http://schemas.microsoft.com/office/word/2010/wordprocessingGroup" xmlns:wpi="http://schemas.microsoft.com/office/word/2010/wordprocessingInk" xmlns:wne="http://schemas.microsoft.com/office/word/2006/wordml" xmlns:wps="http://schemas.microsoft.com/office/word/2010/wordprocessingShape" mc:Ignorable="w14 w15 w16se w16cid w16 w16cex w16sdtdh w16sdtfl w16du wp14">
   <w:abstractNum w:abstractNumId="0" w15:restartNumberingAfterBreak="0">
     <w:nsid w:val="01EE3F38"/>
     <w:multiLevelType w:val="hybridMultilevel"/>

</xml_diff>

<commit_message>
Cập nhật phiên bản mới
</commit_message>
<xml_diff>
--- a/HuongDan.docx
+++ b/HuongDan.docx
@@ -1,6 +1,6 @@
 
 <file path=word/document.xml><?xml version="1.0" encoding="utf-8"?>
-<w:document xmlns:wpc="http://schemas.microsoft.com/office/word/2010/wordprocessingCanvas" xmlns:cx="http://schemas.microsoft.com/office/drawing/2014/chartex" xmlns:cx1="http://schemas.microsoft.com/office/drawing/2015/9/8/chartex" xmlns:cx2="http://schemas.microsoft.com/office/drawing/2015/10/21/chartex" xmlns:cx3="http://schemas.microsoft.com/office/drawing/2016/5/9/chartex" xmlns:cx4="http://schemas.microsoft.com/office/drawing/2016/5/10/chartex" xmlns:cx5="http://schemas.microsoft.com/office/drawing/2016/5/11/chartex" xmlns:cx6="http://schemas.microsoft.com/office/drawing/2016/5/12/chartex" xmlns:cx7="http://schemas.microsoft.com/office/drawing/2016/5/13/chartex" xmlns:cx8="http://schemas.microsoft.com/office/drawing/2016/5/14/chartex" xmlns:mc="http://schemas.openxmlformats.org/markup-compatibility/2006" xmlns:aink="http://schemas.microsoft.com/office/drawing/2016/ink" xmlns:am3d="http://schemas.microsoft.com/office/drawing/2017/model3d" xmlns:o="urn:schemas-microsoft-com:office:office" xmlns:oel="http://schemas.microsoft.com/office/2019/extlst" xmlns:r="http://schemas.openxmlformats.org/officeDocument/2006/relationships" xmlns:m="http://schemas.openxmlformats.org/officeDocument/2006/math" xmlns:v="urn:schemas-microsoft-com:vml" xmlns:wp14="http://schemas.microsoft.com/office/word/2010/wordprocessingDrawing" xmlns:wp="http://schemas.openxmlformats.org/drawingml/2006/wordprocessingDrawing" xmlns:w10="urn:schemas-microsoft-com:office:word" xmlns:w="http://schemas.openxmlformats.org/wordprocessingml/2006/main" xmlns:w14="http://schemas.microsoft.com/office/word/2010/wordml" xmlns:w15="http://schemas.microsoft.com/office/word/2012/wordml" xmlns:w16cei="http://schemas.microsoft.com/office/word/2026/wordml/cei" xmlns:w16cex="http://schemas.microsoft.com/office/word/2018/wordml/cex" xmlns:w16cid="http://schemas.microsoft.com/office/word/2016/wordml/cid" xmlns:w16="http://schemas.microsoft.com/office/word/2018/wordml" xmlns:w16du="http://schemas.microsoft.com/office/word/2023/wordml/word16du" xmlns:w16sdtdh="http://schemas.microsoft.com/office/word/2020/wordml/sdtdatahash" xmlns:w16sdtfl="http://schemas.microsoft.com/office/word/2024/wordml/sdtformatlock" xmlns:w16se="http://schemas.microsoft.com/office/word/2015/wordml/symex" xmlns:wpg="http://schemas.microsoft.com/office/word/2010/wordprocessingGroup" xmlns:wpi="http://schemas.microsoft.com/office/word/2010/wordprocessingInk" xmlns:wne="http://schemas.microsoft.com/office/word/2006/wordml" xmlns:wps="http://schemas.microsoft.com/office/word/2010/wordprocessingShape" mc:Ignorable="w14 w15 w16se w16cid w16 w16cex w16sdtdh w16sdtfl w16du wp14">
+<w:document xmlns:wpc="http://schemas.microsoft.com/office/word/2010/wordprocessingCanvas" xmlns:cx="http://schemas.microsoft.com/office/drawing/2014/chartex" xmlns:cx1="http://schemas.microsoft.com/office/drawing/2015/9/8/chartex" xmlns:cx2="http://schemas.microsoft.com/office/drawing/2015/10/21/chartex" xmlns:cx3="http://schemas.microsoft.com/office/drawing/2016/5/9/chartex" xmlns:cx4="http://schemas.microsoft.com/office/drawing/2016/5/10/chartex" xmlns:cx5="http://schemas.microsoft.com/office/drawing/2016/5/11/chartex" xmlns:cx6="http://schemas.microsoft.com/office/drawing/2016/5/12/chartex" xmlns:cx7="http://schemas.microsoft.com/office/drawing/2016/5/13/chartex" xmlns:cx8="http://schemas.microsoft.com/office/drawing/2016/5/14/chartex" xmlns:mc="http://schemas.openxmlformats.org/markup-compatibility/2006" xmlns:aink="http://schemas.microsoft.com/office/drawing/2016/ink" xmlns:am3d="http://schemas.microsoft.com/office/drawing/2017/model3d" xmlns:o="urn:schemas-microsoft-com:office:office" xmlns:oel="http://schemas.microsoft.com/office/2019/extlst" xmlns:r="http://schemas.openxmlformats.org/officeDocument/2006/relationships" xmlns:m="http://schemas.openxmlformats.org/officeDocument/2006/math" xmlns:v="urn:schemas-microsoft-com:vml" xmlns:wp14="http://schemas.microsoft.com/office/word/2010/wordprocessingDrawing" xmlns:wp="http://schemas.openxmlformats.org/drawingml/2006/wordprocessingDrawing" xmlns:w10="urn:schemas-microsoft-com:office:word" xmlns:w="http://schemas.openxmlformats.org/wordprocessingml/2006/main" xmlns:w14="http://schemas.microsoft.com/office/word/2010/wordml" xmlns:w15="http://schemas.microsoft.com/office/word/2012/wordml" xmlns:w16cex="http://schemas.microsoft.com/office/word/2018/wordml/cex" xmlns:w16cid="http://schemas.microsoft.com/office/word/2016/wordml/cid" xmlns:w16="http://schemas.microsoft.com/office/word/2018/wordml" xmlns:w16du="http://schemas.microsoft.com/office/word/2023/wordml/word16du" xmlns:w16sdtdh="http://schemas.microsoft.com/office/word/2020/wordml/sdtdatahash" xmlns:w16sdtfl="http://schemas.microsoft.com/office/word/2024/wordml/sdtformatlock" xmlns:w16se="http://schemas.microsoft.com/office/word/2015/wordml/symex" xmlns:wpg="http://schemas.microsoft.com/office/word/2010/wordprocessingGroup" xmlns:wpi="http://schemas.microsoft.com/office/word/2010/wordprocessingInk" xmlns:wne="http://schemas.microsoft.com/office/word/2006/wordml" xmlns:wps="http://schemas.microsoft.com/office/word/2010/wordprocessingShape" mc:Ignorable="w14 w15 w16se w16cid w16 w16cex w16sdtdh w16sdtfl w16du wp14">
   <w:body>
     <w:p>
       <w:pPr>
@@ -133,7 +133,7 @@
               </wp:anchor>
             </w:drawing>
           </mc:Choice>
-          <mc:Fallback>
+          <mc:Fallback xmlns:w16cei="http://schemas.microsoft.com/office/word/2026/wordml/cei">
             <w:pict>
               <v:line w14:anchorId="4305DE87" id="Straight Connector 1" o:spid="_x0000_s1026" style="position:absolute;z-index:251659264;visibility:visible;mso-wrap-style:square;mso-wrap-distance-left:9pt;mso-wrap-distance-top:0;mso-wrap-distance-right:9pt;mso-wrap-distance-bottom:0;mso-position-horizontal:absolute;mso-position-horizontal-relative:text;mso-position-vertical:absolute;mso-position-vertical-relative:text" from="179.85pt,2pt" to="299.15pt,2pt" o:gfxdata="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" strokecolor="#156082 [3204]" strokeweight=".5pt">
                 <v:stroke joinstyle="miter"/>
@@ -5889,7 +5889,7 @@
           <w:bCs/>
           <w:lang w:val="pt-BR"/>
         </w:rPr>
-        <w:t>Thi đua năm 2026</w:t>
+        <w:t>Thi đua 2026</w:t>
       </w:r>
       <w:r>
         <w:rPr>
@@ -13922,7 +13922,7 @@
 </file>
 
 <file path=word/endnotes.xml><?xml version="1.0" encoding="utf-8"?>
-<w:endnotes xmlns:wpc="http://schemas.microsoft.com/office/word/2010/wordprocessingCanvas" xmlns:cx="http://schemas.microsoft.com/office/drawing/2014/chartex" xmlns:cx1="http://schemas.microsoft.com/office/drawing/2015/9/8/chartex" xmlns:cx2="http://schemas.microsoft.com/office/drawing/2015/10/21/chartex" xmlns:cx3="http://schemas.microsoft.com/office/drawing/2016/5/9/chartex" xmlns:cx4="http://schemas.microsoft.com/office/drawing/2016/5/10/chartex" xmlns:cx5="http://schemas.microsoft.com/office/drawing/2016/5/11/chartex" xmlns:cx6="http://schemas.microsoft.com/office/drawing/2016/5/12/chartex" xmlns:cx7="http://schemas.microsoft.com/office/drawing/2016/5/13/chartex" xmlns:cx8="http://schemas.microsoft.com/office/drawing/2016/5/14/chartex" xmlns:mc="http://schemas.openxmlformats.org/markup-compatibility/2006" xmlns:aink="http://schemas.microsoft.com/office/drawing/2016/ink" xmlns:am3d="http://schemas.microsoft.com/office/drawing/2017/model3d" xmlns:o="urn:schemas-microsoft-com:office:office" xmlns:oel="http://schemas.microsoft.com/office/2019/extlst" xmlns:r="http://schemas.openxmlformats.org/officeDocument/2006/relationships" xmlns:m="http://schemas.openxmlformats.org/officeDocument/2006/math" xmlns:v="urn:schemas-microsoft-com:vml" xmlns:wp14="http://schemas.microsoft.com/office/word/2010/wordprocessingDrawing" xmlns:wp="http://schemas.openxmlformats.org/drawingml/2006/wordprocessingDrawing" xmlns:w10="urn:schemas-microsoft-com:office:word" xmlns:w="http://schemas.openxmlformats.org/wordprocessingml/2006/main" xmlns:w14="http://schemas.microsoft.com/office/word/2010/wordml" xmlns:w15="http://schemas.microsoft.com/office/word/2012/wordml" xmlns:w16cei="http://schemas.microsoft.com/office/word/2026/wordml/cei" xmlns:w16cex="http://schemas.microsoft.com/office/word/2018/wordml/cex" xmlns:w16cid="http://schemas.microsoft.com/office/word/2016/wordml/cid" xmlns:w16="http://schemas.microsoft.com/office/word/2018/wordml" xmlns:w16du="http://schemas.microsoft.com/office/word/2023/wordml/word16du" xmlns:w16sdtdh="http://schemas.microsoft.com/office/word/2020/wordml/sdtdatahash" xmlns:w16sdtfl="http://schemas.microsoft.com/office/word/2024/wordml/sdtformatlock" xmlns:w16se="http://schemas.microsoft.com/office/word/2015/wordml/symex" xmlns:wpg="http://schemas.microsoft.com/office/word/2010/wordprocessingGroup" xmlns:wpi="http://schemas.microsoft.com/office/word/2010/wordprocessingInk" xmlns:wne="http://schemas.microsoft.com/office/word/2006/wordml" xmlns:wps="http://schemas.microsoft.com/office/word/2010/wordprocessingShape" mc:Ignorable="w14 w15 w16se w16cid w16 w16cex w16sdtdh w16sdtfl w16du wp14">
+<w:endnotes xmlns:wpc="http://schemas.microsoft.com/office/word/2010/wordprocessingCanvas" xmlns:cx="http://schemas.microsoft.com/office/drawing/2014/chartex" xmlns:cx1="http://schemas.microsoft.com/office/drawing/2015/9/8/chartex" xmlns:cx2="http://schemas.microsoft.com/office/drawing/2015/10/21/chartex" xmlns:cx3="http://schemas.microsoft.com/office/drawing/2016/5/9/chartex" xmlns:cx4="http://schemas.microsoft.com/office/drawing/2016/5/10/chartex" xmlns:cx5="http://schemas.microsoft.com/office/drawing/2016/5/11/chartex" xmlns:cx6="http://schemas.microsoft.com/office/drawing/2016/5/12/chartex" xmlns:cx7="http://schemas.microsoft.com/office/drawing/2016/5/13/chartex" xmlns:cx8="http://schemas.microsoft.com/office/drawing/2016/5/14/chartex" xmlns:mc="http://schemas.openxmlformats.org/markup-compatibility/2006" xmlns:aink="http://schemas.microsoft.com/office/drawing/2016/ink" xmlns:am3d="http://schemas.microsoft.com/office/drawing/2017/model3d" xmlns:o="urn:schemas-microsoft-com:office:office" xmlns:oel="http://schemas.microsoft.com/office/2019/extlst" xmlns:r="http://schemas.openxmlformats.org/officeDocument/2006/relationships" xmlns:m="http://schemas.openxmlformats.org/officeDocument/2006/math" xmlns:v="urn:schemas-microsoft-com:vml" xmlns:wp14="http://schemas.microsoft.com/office/word/2010/wordprocessingDrawing" xmlns:wp="http://schemas.openxmlformats.org/drawingml/2006/wordprocessingDrawing" xmlns:w10="urn:schemas-microsoft-com:office:word" xmlns:w="http://schemas.openxmlformats.org/wordprocessingml/2006/main" xmlns:w14="http://schemas.microsoft.com/office/word/2010/wordml" xmlns:w15="http://schemas.microsoft.com/office/word/2012/wordml" xmlns:w16cex="http://schemas.microsoft.com/office/word/2018/wordml/cex" xmlns:w16cid="http://schemas.microsoft.com/office/word/2016/wordml/cid" xmlns:w16="http://schemas.microsoft.com/office/word/2018/wordml" xmlns:w16du="http://schemas.microsoft.com/office/word/2023/wordml/word16du" xmlns:w16sdtdh="http://schemas.microsoft.com/office/word/2020/wordml/sdtdatahash" xmlns:w16sdtfl="http://schemas.microsoft.com/office/word/2024/wordml/sdtformatlock" xmlns:w16se="http://schemas.microsoft.com/office/word/2015/wordml/symex" xmlns:wpg="http://schemas.microsoft.com/office/word/2010/wordprocessingGroup" xmlns:wpi="http://schemas.microsoft.com/office/word/2010/wordprocessingInk" xmlns:wne="http://schemas.microsoft.com/office/word/2006/wordml" xmlns:wps="http://schemas.microsoft.com/office/word/2010/wordprocessingShape" mc:Ignorable="w14 w15 w16se w16cid w16 w16cex w16sdtdh w16sdtfl w16du wp14">
   <w:endnote w:type="separator" w:id="-1">
     <w:p>
       <w:pPr>
@@ -13947,7 +13947,7 @@
 </file>
 
 <file path=word/footnotes.xml><?xml version="1.0" encoding="utf-8"?>
-<w:footnotes xmlns:wpc="http://schemas.microsoft.com/office/word/2010/wordprocessingCanvas" xmlns:cx="http://schemas.microsoft.com/office/drawing/2014/chartex" xmlns:cx1="http://schemas.microsoft.com/office/drawing/2015/9/8/chartex" xmlns:cx2="http://schemas.microsoft.com/office/drawing/2015/10/21/chartex" xmlns:cx3="http://schemas.microsoft.com/office/drawing/2016/5/9/chartex" xmlns:cx4="http://schemas.microsoft.com/office/drawing/2016/5/10/chartex" xmlns:cx5="http://schemas.microsoft.com/office/drawing/2016/5/11/chartex" xmlns:cx6="http://schemas.microsoft.com/office/drawing/2016/5/12/chartex" xmlns:cx7="http://schemas.microsoft.com/office/drawing/2016/5/13/chartex" xmlns:cx8="http://schemas.microsoft.com/office/drawing/2016/5/14/chartex" xmlns:mc="http://schemas.openxmlformats.org/markup-compatibility/2006" xmlns:aink="http://schemas.microsoft.com/office/drawing/2016/ink" xmlns:am3d="http://schemas.microsoft.com/office/drawing/2017/model3d" xmlns:o="urn:schemas-microsoft-com:office:office" xmlns:oel="http://schemas.microsoft.com/office/2019/extlst" xmlns:r="http://schemas.openxmlformats.org/officeDocument/2006/relationships" xmlns:m="http://schemas.openxmlformats.org/officeDocument/2006/math" xmlns:v="urn:schemas-microsoft-com:vml" xmlns:wp14="http://schemas.microsoft.com/office/word/2010/wordprocessingDrawing" xmlns:wp="http://schemas.openxmlformats.org/drawingml/2006/wordprocessingDrawing" xmlns:w10="urn:schemas-microsoft-com:office:word" xmlns:w="http://schemas.openxmlformats.org/wordprocessingml/2006/main" xmlns:w14="http://schemas.microsoft.com/office/word/2010/wordml" xmlns:w15="http://schemas.microsoft.com/office/word/2012/wordml" xmlns:w16cei="http://schemas.microsoft.com/office/word/2026/wordml/cei" xmlns:w16cex="http://schemas.microsoft.com/office/word/2018/wordml/cex" xmlns:w16cid="http://schemas.microsoft.com/office/word/2016/wordml/cid" xmlns:w16="http://schemas.microsoft.com/office/word/2018/wordml" xmlns:w16du="http://schemas.microsoft.com/office/word/2023/wordml/word16du" xmlns:w16sdtdh="http://schemas.microsoft.com/office/word/2020/wordml/sdtdatahash" xmlns:w16sdtfl="http://schemas.microsoft.com/office/word/2024/wordml/sdtformatlock" xmlns:w16se="http://schemas.microsoft.com/office/word/2015/wordml/symex" xmlns:wpg="http://schemas.microsoft.com/office/word/2010/wordprocessingGroup" xmlns:wpi="http://schemas.microsoft.com/office/word/2010/wordprocessingInk" xmlns:wne="http://schemas.microsoft.com/office/word/2006/wordml" xmlns:wps="http://schemas.microsoft.com/office/word/2010/wordprocessingShape" mc:Ignorable="w14 w15 w16se w16cid w16 w16cex w16sdtdh w16sdtfl w16du wp14">
+<w:footnotes xmlns:wpc="http://schemas.microsoft.com/office/word/2010/wordprocessingCanvas" xmlns:cx="http://schemas.microsoft.com/office/drawing/2014/chartex" xmlns:cx1="http://schemas.microsoft.com/office/drawing/2015/9/8/chartex" xmlns:cx2="http://schemas.microsoft.com/office/drawing/2015/10/21/chartex" xmlns:cx3="http://schemas.microsoft.com/office/drawing/2016/5/9/chartex" xmlns:cx4="http://schemas.microsoft.com/office/drawing/2016/5/10/chartex" xmlns:cx5="http://schemas.microsoft.com/office/drawing/2016/5/11/chartex" xmlns:cx6="http://schemas.microsoft.com/office/drawing/2016/5/12/chartex" xmlns:cx7="http://schemas.microsoft.com/office/drawing/2016/5/13/chartex" xmlns:cx8="http://schemas.microsoft.com/office/drawing/2016/5/14/chartex" xmlns:mc="http://schemas.openxmlformats.org/markup-compatibility/2006" xmlns:aink="http://schemas.microsoft.com/office/drawing/2016/ink" xmlns:am3d="http://schemas.microsoft.com/office/drawing/2017/model3d" xmlns:o="urn:schemas-microsoft-com:office:office" xmlns:oel="http://schemas.microsoft.com/office/2019/extlst" xmlns:r="http://schemas.openxmlformats.org/officeDocument/2006/relationships" xmlns:m="http://schemas.openxmlformats.org/officeDocument/2006/math" xmlns:v="urn:schemas-microsoft-com:vml" xmlns:wp14="http://schemas.microsoft.com/office/word/2010/wordprocessingDrawing" xmlns:wp="http://schemas.openxmlformats.org/drawingml/2006/wordprocessingDrawing" xmlns:w10="urn:schemas-microsoft-com:office:word" xmlns:w="http://schemas.openxmlformats.org/wordprocessingml/2006/main" xmlns:w14="http://schemas.microsoft.com/office/word/2010/wordml" xmlns:w15="http://schemas.microsoft.com/office/word/2012/wordml" xmlns:w16cex="http://schemas.microsoft.com/office/word/2018/wordml/cex" xmlns:w16cid="http://schemas.microsoft.com/office/word/2016/wordml/cid" xmlns:w16="http://schemas.microsoft.com/office/word/2018/wordml" xmlns:w16du="http://schemas.microsoft.com/office/word/2023/wordml/word16du" xmlns:w16sdtdh="http://schemas.microsoft.com/office/word/2020/wordml/sdtdatahash" xmlns:w16sdtfl="http://schemas.microsoft.com/office/word/2024/wordml/sdtformatlock" xmlns:w16se="http://schemas.microsoft.com/office/word/2015/wordml/symex" xmlns:wpg="http://schemas.microsoft.com/office/word/2010/wordprocessingGroup" xmlns:wpi="http://schemas.microsoft.com/office/word/2010/wordprocessingInk" xmlns:wne="http://schemas.microsoft.com/office/word/2006/wordml" xmlns:wps="http://schemas.microsoft.com/office/word/2010/wordprocessingShape" mc:Ignorable="w14 w15 w16se w16cid w16 w16cex w16sdtdh w16sdtfl w16du wp14">
   <w:footnote w:type="separator" w:id="-1">
     <w:p>
       <w:pPr>
@@ -13972,7 +13972,7 @@
 </file>
 
 <file path=word/header1.xml><?xml version="1.0" encoding="utf-8"?>
-<w:hdr xmlns:wpc="http://schemas.microsoft.com/office/word/2010/wordprocessingCanvas" xmlns:cx="http://schemas.microsoft.com/office/drawing/2014/chartex" xmlns:cx1="http://schemas.microsoft.com/office/drawing/2015/9/8/chartex" xmlns:cx2="http://schemas.microsoft.com/office/drawing/2015/10/21/chartex" xmlns:cx3="http://schemas.microsoft.com/office/drawing/2016/5/9/chartex" xmlns:cx4="http://schemas.microsoft.com/office/drawing/2016/5/10/chartex" xmlns:cx5="http://schemas.microsoft.com/office/drawing/2016/5/11/chartex" xmlns:cx6="http://schemas.microsoft.com/office/drawing/2016/5/12/chartex" xmlns:cx7="http://schemas.microsoft.com/office/drawing/2016/5/13/chartex" xmlns:cx8="http://schemas.microsoft.com/office/drawing/2016/5/14/chartex" xmlns:mc="http://schemas.openxmlformats.org/markup-compatibility/2006" xmlns:aink="http://schemas.microsoft.com/office/drawing/2016/ink" xmlns:am3d="http://schemas.microsoft.com/office/drawing/2017/model3d" xmlns:o="urn:schemas-microsoft-com:office:office" xmlns:oel="http://schemas.microsoft.com/office/2019/extlst" xmlns:r="http://schemas.openxmlformats.org/officeDocument/2006/relationships" xmlns:m="http://schemas.openxmlformats.org/officeDocument/2006/math" xmlns:v="urn:schemas-microsoft-com:vml" xmlns:wp14="http://schemas.microsoft.com/office/word/2010/wordprocessingDrawing" xmlns:wp="http://schemas.openxmlformats.org/drawingml/2006/wordprocessingDrawing" xmlns:w10="urn:schemas-microsoft-com:office:word" xmlns:w="http://schemas.openxmlformats.org/wordprocessingml/2006/main" xmlns:w14="http://schemas.microsoft.com/office/word/2010/wordml" xmlns:w15="http://schemas.microsoft.com/office/word/2012/wordml" xmlns:w16cei="http://schemas.microsoft.com/office/word/2026/wordml/cei" xmlns:w16cex="http://schemas.microsoft.com/office/word/2018/wordml/cex" xmlns:w16cid="http://schemas.microsoft.com/office/word/2016/wordml/cid" xmlns:w16="http://schemas.microsoft.com/office/word/2018/wordml" xmlns:w16du="http://schemas.microsoft.com/office/word/2023/wordml/word16du" xmlns:w16sdtdh="http://schemas.microsoft.com/office/word/2020/wordml/sdtdatahash" xmlns:w16sdtfl="http://schemas.microsoft.com/office/word/2024/wordml/sdtformatlock" xmlns:w16se="http://schemas.microsoft.com/office/word/2015/wordml/symex" xmlns:wpg="http://schemas.microsoft.com/office/word/2010/wordprocessingGroup" xmlns:wpi="http://schemas.microsoft.com/office/word/2010/wordprocessingInk" xmlns:wne="http://schemas.microsoft.com/office/word/2006/wordml" xmlns:wps="http://schemas.microsoft.com/office/word/2010/wordprocessingShape" mc:Ignorable="w14 w15 w16se w16cid w16 w16cex w16sdtdh w16sdtfl w16du wp14">
+<w:hdr xmlns:wpc="http://schemas.microsoft.com/office/word/2010/wordprocessingCanvas" xmlns:cx="http://schemas.microsoft.com/office/drawing/2014/chartex" xmlns:cx1="http://schemas.microsoft.com/office/drawing/2015/9/8/chartex" xmlns:cx2="http://schemas.microsoft.com/office/drawing/2015/10/21/chartex" xmlns:cx3="http://schemas.microsoft.com/office/drawing/2016/5/9/chartex" xmlns:cx4="http://schemas.microsoft.com/office/drawing/2016/5/10/chartex" xmlns:cx5="http://schemas.microsoft.com/office/drawing/2016/5/11/chartex" xmlns:cx6="http://schemas.microsoft.com/office/drawing/2016/5/12/chartex" xmlns:cx7="http://schemas.microsoft.com/office/drawing/2016/5/13/chartex" xmlns:cx8="http://schemas.microsoft.com/office/drawing/2016/5/14/chartex" xmlns:mc="http://schemas.openxmlformats.org/markup-compatibility/2006" xmlns:aink="http://schemas.microsoft.com/office/drawing/2016/ink" xmlns:am3d="http://schemas.microsoft.com/office/drawing/2017/model3d" xmlns:o="urn:schemas-microsoft-com:office:office" xmlns:oel="http://schemas.microsoft.com/office/2019/extlst" xmlns:r="http://schemas.openxmlformats.org/officeDocument/2006/relationships" xmlns:m="http://schemas.openxmlformats.org/officeDocument/2006/math" xmlns:v="urn:schemas-microsoft-com:vml" xmlns:wp14="http://schemas.microsoft.com/office/word/2010/wordprocessingDrawing" xmlns:wp="http://schemas.openxmlformats.org/drawingml/2006/wordprocessingDrawing" xmlns:w10="urn:schemas-microsoft-com:office:word" xmlns:w="http://schemas.openxmlformats.org/wordprocessingml/2006/main" xmlns:w14="http://schemas.microsoft.com/office/word/2010/wordml" xmlns:w15="http://schemas.microsoft.com/office/word/2012/wordml" xmlns:w16cex="http://schemas.microsoft.com/office/word/2018/wordml/cex" xmlns:w16cid="http://schemas.microsoft.com/office/word/2016/wordml/cid" xmlns:w16="http://schemas.microsoft.com/office/word/2018/wordml" xmlns:w16du="http://schemas.microsoft.com/office/word/2023/wordml/word16du" xmlns:w16sdtdh="http://schemas.microsoft.com/office/word/2020/wordml/sdtdatahash" xmlns:w16sdtfl="http://schemas.microsoft.com/office/word/2024/wordml/sdtformatlock" xmlns:w16se="http://schemas.microsoft.com/office/word/2015/wordml/symex" xmlns:wpg="http://schemas.microsoft.com/office/word/2010/wordprocessingGroup" xmlns:wpi="http://schemas.microsoft.com/office/word/2010/wordprocessingInk" xmlns:wne="http://schemas.microsoft.com/office/word/2006/wordml" xmlns:wps="http://schemas.microsoft.com/office/word/2010/wordprocessingShape" mc:Ignorable="w14 w15 w16se w16cid w16 w16cex w16sdtdh w16sdtfl w16du wp14">
   <w:p>
     <w:pPr>
       <w:pStyle w:val="Header"/>
@@ -14022,7 +14022,7 @@
 </file>
 
 <file path=word/numbering.xml><?xml version="1.0" encoding="utf-8"?>
-<w:numbering xmlns:wpc="http://schemas.microsoft.com/office/word/2010/wordprocessingCanvas" xmlns:cx="http://schemas.microsoft.com/office/drawing/2014/chartex" xmlns:cx1="http://schemas.microsoft.com/office/drawing/2015/9/8/chartex" xmlns:cx2="http://schemas.microsoft.com/office/drawing/2015/10/21/chartex" xmlns:cx3="http://schemas.microsoft.com/office/drawing/2016/5/9/chartex" xmlns:cx4="http://schemas.microsoft.com/office/drawing/2016/5/10/chartex" xmlns:cx5="http://schemas.microsoft.com/office/drawing/2016/5/11/chartex" xmlns:cx6="http://schemas.microsoft.com/office/drawing/2016/5/12/chartex" xmlns:cx7="http://schemas.microsoft.com/office/drawing/2016/5/13/chartex" xmlns:cx8="http://schemas.microsoft.com/office/drawing/2016/5/14/chartex" xmlns:mc="http://schemas.openxmlformats.org/markup-compatibility/2006" xmlns:aink="http://schemas.microsoft.com/office/drawing/2016/ink" xmlns:am3d="http://schemas.microsoft.com/office/drawing/2017/model3d" xmlns:o="urn:schemas-microsoft-com:office:office" xmlns:oel="http://schemas.microsoft.com/office/2019/extlst" xmlns:r="http://schemas.openxmlformats.org/officeDocument/2006/relationships" xmlns:m="http://schemas.openxmlformats.org/officeDocument/2006/math" xmlns:v="urn:schemas-microsoft-com:vml" xmlns:wp14="http://schemas.microsoft.com/office/word/2010/wordprocessingDrawing" xmlns:wp="http://schemas.openxmlformats.org/drawingml/2006/wordprocessingDrawing" xmlns:w10="urn:schemas-microsoft-com:office:word" xmlns:w="http://schemas.openxmlformats.org/wordprocessingml/2006/main" xmlns:w14="http://schemas.microsoft.com/office/word/2010/wordml" xmlns:w15="http://schemas.microsoft.com/office/word/2012/wordml" xmlns:w16cei="http://schemas.microsoft.com/office/word/2026/wordml/cei" xmlns:w16cex="http://schemas.microsoft.com/office/word/2018/wordml/cex" xmlns:w16cid="http://schemas.microsoft.com/office/word/2016/wordml/cid" xmlns:w16="http://schemas.microsoft.com/office/word/2018/wordml" xmlns:w16du="http://schemas.microsoft.com/office/word/2023/wordml/word16du" xmlns:w16sdtdh="http://schemas.microsoft.com/office/word/2020/wordml/sdtdatahash" xmlns:w16sdtfl="http://schemas.microsoft.com/office/word/2024/wordml/sdtformatlock" xmlns:w16se="http://schemas.microsoft.com/office/word/2015/wordml/symex" xmlns:wpg="http://schemas.microsoft.com/office/word/2010/wordprocessingGroup" xmlns:wpi="http://schemas.microsoft.com/office/word/2010/wordprocessingInk" xmlns:wne="http://schemas.microsoft.com/office/word/2006/wordml" xmlns:wps="http://schemas.microsoft.com/office/word/2010/wordprocessingShape" mc:Ignorable="w14 w15 w16se w16cid w16 w16cex w16sdtdh w16sdtfl w16du wp14">
+<w:numbering xmlns:wpc="http://schemas.microsoft.com/office/word/2010/wordprocessingCanvas" xmlns:cx="http://schemas.microsoft.com/office/drawing/2014/chartex" xmlns:cx1="http://schemas.microsoft.com/office/drawing/2015/9/8/chartex" xmlns:cx2="http://schemas.microsoft.com/office/drawing/2015/10/21/chartex" xmlns:cx3="http://schemas.microsoft.com/office/drawing/2016/5/9/chartex" xmlns:cx4="http://schemas.microsoft.com/office/drawing/2016/5/10/chartex" xmlns:cx5="http://schemas.microsoft.com/office/drawing/2016/5/11/chartex" xmlns:cx6="http://schemas.microsoft.com/office/drawing/2016/5/12/chartex" xmlns:cx7="http://schemas.microsoft.com/office/drawing/2016/5/13/chartex" xmlns:cx8="http://schemas.microsoft.com/office/drawing/2016/5/14/chartex" xmlns:mc="http://schemas.openxmlformats.org/markup-compatibility/2006" xmlns:aink="http://schemas.microsoft.com/office/drawing/2016/ink" xmlns:am3d="http://schemas.microsoft.com/office/drawing/2017/model3d" xmlns:o="urn:schemas-microsoft-com:office:office" xmlns:oel="http://schemas.microsoft.com/office/2019/extlst" xmlns:r="http://schemas.openxmlformats.org/officeDocument/2006/relationships" xmlns:m="http://schemas.openxmlformats.org/officeDocument/2006/math" xmlns:v="urn:schemas-microsoft-com:vml" xmlns:wp14="http://schemas.microsoft.com/office/word/2010/wordprocessingDrawing" xmlns:wp="http://schemas.openxmlformats.org/drawingml/2006/wordprocessingDrawing" xmlns:w10="urn:schemas-microsoft-com:office:word" xmlns:w="http://schemas.openxmlformats.org/wordprocessingml/2006/main" xmlns:w14="http://schemas.microsoft.com/office/word/2010/wordml" xmlns:w15="http://schemas.microsoft.com/office/word/2012/wordml" xmlns:w16cex="http://schemas.microsoft.com/office/word/2018/wordml/cex" xmlns:w16cid="http://schemas.microsoft.com/office/word/2016/wordml/cid" xmlns:w16="http://schemas.microsoft.com/office/word/2018/wordml" xmlns:w16du="http://schemas.microsoft.com/office/word/2023/wordml/word16du" xmlns:w16sdtdh="http://schemas.microsoft.com/office/word/2020/wordml/sdtdatahash" xmlns:w16sdtfl="http://schemas.microsoft.com/office/word/2024/wordml/sdtformatlock" xmlns:w16se="http://schemas.microsoft.com/office/word/2015/wordml/symex" xmlns:wpg="http://schemas.microsoft.com/office/word/2010/wordprocessingGroup" xmlns:wpi="http://schemas.microsoft.com/office/word/2010/wordprocessingInk" xmlns:wne="http://schemas.microsoft.com/office/word/2006/wordml" xmlns:wps="http://schemas.microsoft.com/office/word/2010/wordprocessingShape" mc:Ignorable="w14 w15 w16se w16cid w16 w16cex w16sdtdh w16sdtfl w16du wp14">
   <w:abstractNum w:abstractNumId="0" w15:restartNumberingAfterBreak="0">
     <w:nsid w:val="01EE3F38"/>
     <w:multiLevelType w:val="hybridMultilevel"/>

</xml_diff>